<commit_message>
Add reviewer notes section to SPEC v3 for client confirmation
Co-Authored-By: Claude Opus 4.6 <noreply@anthropic.com>
</commit_message>
<xml_diff>
--- a/client/spec/SPEC-v3.docx
+++ b/client/spec/SPEC-v3.docx
@@ -2,7 +2,7 @@
 <file path=word/document.xml><?xml version="1.0" encoding="utf-8"?>
 <w:document xmlns:w="http://schemas.openxmlformats.org/wordprocessingml/2006/main" xmlns:m="http://schemas.openxmlformats.org/officeDocument/2006/math" xmlns:r="http://schemas.openxmlformats.org/officeDocument/2006/relationships" xmlns:o="urn:schemas-microsoft-com:office:office" xmlns:v="urn:schemas-microsoft-com:vml" xmlns:w10="urn:schemas-microsoft-com:office:word" xmlns:a="http://schemas.openxmlformats.org/drawingml/2006/main" xmlns:pic="http://schemas.openxmlformats.org/drawingml/2006/picture" xmlns:wp="http://schemas.openxmlformats.org/drawingml/2006/wordprocessingDrawing">
   <w:body>
-    <w:bookmarkStart w:id="83" w:name="X0e2fe1289692e0f9c870d6954644a4c32d6d554"/>
+    <w:bookmarkStart w:id="84" w:name="X0e2fe1289692e0f9c870d6954644a4c32d6d554"/>
     <w:p>
       <w:pPr>
         <w:pStyle w:val="Heading1"/>
@@ -189,16 +189,184 @@
         </w:pict>
       </w:r>
     </w:p>
-    <w:bookmarkStart w:id="25" w:name="data-model"/>
+    <w:bookmarkStart w:id="9" w:name="X6195bc5a3d19b8dbeb7764c1b7553a7a4c0138a"/>
     <w:p>
       <w:pPr>
         <w:pStyle w:val="Heading2"/>
       </w:pPr>
       <w:r>
+        <w:t xml:space="preserve">Reviewer Notes — Points requiring confirmation</w:t>
+      </w:r>
+    </w:p>
+    <w:p>
+      <w:pPr>
+        <w:pStyle w:val="FirstParagraph"/>
+      </w:pPr>
+      <w:r>
+        <w:t xml:space="preserve">The following items are design decisions made by the developer that were not explicitly specified by the client. Please confirm or adjust:</w:t>
+      </w:r>
+    </w:p>
+    <w:p>
+      <w:pPr>
+        <w:numPr>
+          <w:ilvl w:val="0"/>
+          <w:numId w:val="1001"/>
+        </w:numPr>
+      </w:pPr>
+      <w:r>
+        <w:rPr>
+          <w:b/>
+          <w:bCs/>
+        </w:rPr>
+        <w:t xml:space="preserve">Scoring default weights</w:t>
+      </w:r>
+      <w:r>
+        <w:t xml:space="preserve">: PB=25% and SB=35% follow your choice of</w:t>
+      </w:r>
+      <w:r>
+        <w:t xml:space="preserve"> </w:t>
+      </w:r>
+      <w:r>
+        <w:t xml:space="preserve">“option b”</w:t>
+      </w:r>
+      <w:r>
+        <w:t xml:space="preserve"> </w:t>
+      </w:r>
+      <w:r>
+        <w:t xml:space="preserve">defaults. However, the Ranking (30%), Cost (10%), and EAP bonus (+5 percentage points) values are carried forward from the original implementation. Are these defaults acceptable, or would you like different values? (Remember: these are now configurable per edition, so they can be changed at any time — this only sets the initial defaults.)</w:t>
+      </w:r>
+    </w:p>
+    <w:p>
+      <w:pPr>
+        <w:numPr>
+          <w:ilvl w:val="0"/>
+          <w:numId w:val="1001"/>
+        </w:numPr>
+      </w:pPr>
+      <w:r>
+        <w:rPr>
+          <w:b/>
+          <w:bCs/>
+        </w:rPr>
+        <w:t xml:space="preserve">Counter-offer locking for non-monetary booleans</w:t>
+      </w:r>
+      <w:r>
+        <w:t xml:space="preserve">: You confirmed that hotel nights can be requested ON (more nights than offered) and monetary fields are freely adjustable. For the remaining booleans —</w:t>
+      </w:r>
+      <w:r>
+        <w:t xml:space="preserve"> </w:t>
+      </w:r>
+      <w:r>
+        <w:rPr>
+          <w:b/>
+          <w:bCs/>
+        </w:rPr>
+        <w:t xml:space="preserve">dinners, stadium meals, and transport shuttles</w:t>
+      </w:r>
+      <w:r>
+        <w:t xml:space="preserve"> </w:t>
+      </w:r>
+      <w:r>
+        <w:t xml:space="preserve">— we applied the restrictive rule: the athlete can only keep or turn OFF what was offered, but cannot turn ON options that were OFF. Is this correct for all three, or should any of them follow the hotel nights rule (allow requesting more)?</w:t>
+      </w:r>
+    </w:p>
+    <w:p>
+      <w:pPr>
+        <w:numPr>
+          <w:ilvl w:val="0"/>
+          <w:numId w:val="1001"/>
+        </w:numPr>
+      </w:pPr>
+      <w:r>
+        <w:rPr>
+          <w:rStyle w:val="VerbatimChar"/>
+          <w:b/>
+          <w:bCs/>
+        </w:rPr>
+        <w:t xml:space="preserve">GET /events/:id/confirmed-athletes</w:t>
+      </w:r>
+      <w:r>
+        <w:rPr>
+          <w:b/>
+          <w:bCs/>
+        </w:rPr>
+        <w:t xml:space="preserve"> </w:t>
+      </w:r>
+      <w:r>
+        <w:rPr>
+          <w:b/>
+          <w:bCs/>
+        </w:rPr>
+        <w:t xml:space="preserve">endpoint</w:t>
+      </w:r>
+      <w:r>
+        <w:t xml:space="preserve">: We added a public endpoint that returns the list of confirmed athletes for a given event (useful for event pages or media). This was not explicitly requested. Should it be kept, removed, or restricted to authenticated users?</w:t>
+      </w:r>
+    </w:p>
+    <w:p>
+      <w:pPr>
+        <w:numPr>
+          <w:ilvl w:val="0"/>
+          <w:numId w:val="1001"/>
+        </w:numPr>
+      </w:pPr>
+      <w:r>
+        <w:rPr>
+          <w:b/>
+          <w:bCs/>
+        </w:rPr>
+        <w:t xml:space="preserve">Archive/restore permission</w:t>
+      </w:r>
+      <w:r>
+        <w:t xml:space="preserve">: Soft-delete via</w:t>
+      </w:r>
+      <w:r>
+        <w:t xml:space="preserve"> </w:t>
+      </w:r>
+      <w:r>
+        <w:rPr>
+          <w:rStyle w:val="VerbatimChar"/>
+        </w:rPr>
+        <w:t xml:space="preserve">archivedAt</w:t>
+      </w:r>
+      <w:r>
+        <w:t xml:space="preserve"> </w:t>
+      </w:r>
+      <w:r>
+        <w:t xml:space="preserve">is implemented as requested. We restricted archive/restore to</w:t>
+      </w:r>
+      <w:r>
+        <w:t xml:space="preserve"> </w:t>
+      </w:r>
+      <w:r>
+        <w:rPr>
+          <w:b/>
+          <w:bCs/>
+        </w:rPr>
+        <w:t xml:space="preserve">Committee only</w:t>
+      </w:r>
+      <w:r>
+        <w:t xml:space="preserve">. Should collaborators also be able to archive athletes, or is Committee-only correct?</w:t>
+      </w:r>
+    </w:p>
+    <w:p>
+      <w:r>
+        <w:pict>
+          <v:rect style="width:0;height:1.5pt" o:hralign="center" o:hrstd="t" o:hr="t"/>
+        </w:pict>
+      </w:r>
+    </w:p>
+    <w:bookmarkEnd w:id="9"/>
+    <w:bookmarkStart w:id="26" w:name="data-model"/>
+    <w:p>
+      <w:pPr>
+        <w:pStyle w:val="Heading2"/>
+      </w:pPr>
+      <w:r>
         <w:t xml:space="preserve">1. Data Model</w:t>
       </w:r>
     </w:p>
-    <w:bookmarkStart w:id="9" w:name="edition"/>
+    <w:bookmarkStart w:id="10" w:name="edition"/>
     <w:p>
       <w:pPr>
         <w:pStyle w:val="Heading3"/>
@@ -1217,8 +1385,8 @@
         <w:t xml:space="preserve">.</w:t>
       </w:r>
     </w:p>
-    <w:bookmarkEnd w:id="9"/>
-    <w:bookmarkStart w:id="10" w:name="event-catalog-reference-table"/>
+    <w:bookmarkEnd w:id="10"/>
+    <w:bookmarkStart w:id="11" w:name="event-catalog-reference-table"/>
     <w:p>
       <w:pPr>
         <w:pStyle w:val="Heading3"/>
@@ -1600,8 +1768,8 @@
         <w:t xml:space="preserve">(higher distance/height is better). Not stored.</w:t>
       </w:r>
     </w:p>
-    <w:bookmarkEnd w:id="10"/>
-    <w:bookmarkStart w:id="11" w:name="event-edition-specific"/>
+    <w:bookmarkEnd w:id="11"/>
+    <w:bookmarkStart w:id="12" w:name="event-edition-specific"/>
     <w:p>
       <w:pPr>
         <w:pStyle w:val="Heading3"/>
@@ -2802,8 +2970,8 @@
         <w:t xml:space="preserve">.</w:t>
       </w:r>
     </w:p>
-    <w:bookmarkEnd w:id="11"/>
-    <w:bookmarkStart w:id="12" w:name="country-reference-table"/>
+    <w:bookmarkEnd w:id="12"/>
+    <w:bookmarkStart w:id="13" w:name="country-reference-table"/>
     <w:p>
       <w:pPr>
         <w:pStyle w:val="Heading3"/>
@@ -2961,8 +3129,8 @@
         </w:tc>
       </w:tr>
     </w:tbl>
-    <w:bookmarkEnd w:id="12"/>
-    <w:bookmarkStart w:id="13" w:name="eap-city-reference-table"/>
+    <w:bookmarkEnd w:id="13"/>
+    <w:bookmarkStart w:id="14" w:name="eap-city-reference-table"/>
     <w:p>
       <w:pPr>
         <w:pStyle w:val="Heading3"/>
@@ -3146,8 +3314,8 @@
         </w:tc>
       </w:tr>
     </w:tbl>
-    <w:bookmarkEnd w:id="13"/>
-    <w:bookmarkStart w:id="14" w:name="user"/>
+    <w:bookmarkEnd w:id="14"/>
+    <w:bookmarkStart w:id="15" w:name="user"/>
     <w:p>
       <w:pPr>
         <w:pStyle w:val="Heading3"/>
@@ -3890,8 +4058,8 @@
         </w:tc>
       </w:tr>
     </w:tbl>
-    <w:bookmarkEnd w:id="14"/>
-    <w:bookmarkStart w:id="15" w:name="athlete"/>
+    <w:bookmarkEnd w:id="15"/>
+    <w:bookmarkStart w:id="16" w:name="athlete"/>
     <w:p>
       <w:pPr>
         <w:pStyle w:val="Heading3"/>
@@ -6893,8 +7061,8 @@
         <w:t xml:space="preserve">removed from athlete — room assignment lives only on the agreement (see 1.9).</w:t>
       </w:r>
     </w:p>
-    <w:bookmarkEnd w:id="15"/>
-    <w:bookmarkStart w:id="16" w:name="application"/>
+    <w:bookmarkEnd w:id="16"/>
+    <w:bookmarkStart w:id="17" w:name="application"/>
     <w:p>
       <w:pPr>
         <w:pStyle w:val="Heading3"/>
@@ -7750,8 +7918,8 @@
         <w:t xml:space="preserve">(athleteId, eventId, editionId)</w:t>
       </w:r>
     </w:p>
-    <w:bookmarkEnd w:id="16"/>
-    <w:bookmarkStart w:id="17" w:name="agreement"/>
+    <w:bookmarkEnd w:id="17"/>
+    <w:bookmarkStart w:id="18" w:name="agreement"/>
     <w:p>
       <w:pPr>
         <w:pStyle w:val="Heading3"/>
@@ -8979,8 +9147,8 @@
         <w:t xml:space="preserve">          + (transportHotelStadium ? edition.transportHotelStadiumCost : 0)</w:t>
       </w:r>
     </w:p>
-    <w:bookmarkEnd w:id="17"/>
-    <w:bookmarkStart w:id="18" w:name="hotel"/>
+    <w:bookmarkEnd w:id="18"/>
+    <w:bookmarkStart w:id="19" w:name="hotel"/>
     <w:p>
       <w:pPr>
         <w:pStyle w:val="Heading3"/>
@@ -9186,8 +9354,8 @@
         </w:tc>
       </w:tr>
     </w:tbl>
-    <w:bookmarkEnd w:id="18"/>
-    <w:bookmarkStart w:id="19" w:name="hotel-room"/>
+    <w:bookmarkEnd w:id="19"/>
+    <w:bookmarkStart w:id="20" w:name="hotel-room"/>
     <w:p>
       <w:pPr>
         <w:pStyle w:val="Heading3"/>
@@ -9624,8 +9792,8 @@
         </w:tc>
       </w:tr>
     </w:tbl>
-    <w:bookmarkEnd w:id="19"/>
-    <w:bookmarkStart w:id="20" w:name="wa-performance"/>
+    <w:bookmarkEnd w:id="20"/>
+    <w:bookmarkStart w:id="21" w:name="wa-performance"/>
     <w:p>
       <w:pPr>
         <w:pStyle w:val="Heading3"/>
@@ -10086,8 +10254,8 @@
         <w:t xml:space="preserve">rows and recomputes scores.</w:t>
       </w:r>
     </w:p>
-    <w:bookmarkEnd w:id="20"/>
-    <w:bookmarkStart w:id="21" w:name="interaction"/>
+    <w:bookmarkEnd w:id="21"/>
+    <w:bookmarkStart w:id="22" w:name="interaction"/>
     <w:p>
       <w:pPr>
         <w:pStyle w:val="Heading3"/>
@@ -10583,8 +10751,8 @@
         </w:tc>
       </w:tr>
     </w:tbl>
-    <w:bookmarkEnd w:id="21"/>
-    <w:bookmarkStart w:id="22" w:name="email-log"/>
+    <w:bookmarkEnd w:id="22"/>
+    <w:bookmarkStart w:id="23" w:name="email-log"/>
     <w:p>
       <w:pPr>
         <w:pStyle w:val="Heading3"/>
@@ -10994,8 +11162,8 @@
         </w:tc>
       </w:tr>
     </w:tbl>
-    <w:bookmarkEnd w:id="22"/>
-    <w:bookmarkStart w:id="23" w:name="session"/>
+    <w:bookmarkEnd w:id="23"/>
+    <w:bookmarkStart w:id="24" w:name="session"/>
     <w:p>
       <w:pPr>
         <w:pStyle w:val="Heading3"/>
@@ -11188,8 +11356,8 @@
         </w:tc>
       </w:tr>
     </w:tbl>
-    <w:bookmarkEnd w:id="23"/>
-    <w:bookmarkStart w:id="24" w:name="magic-link"/>
+    <w:bookmarkEnd w:id="24"/>
+    <w:bookmarkStart w:id="25" w:name="magic-link"/>
     <w:p>
       <w:pPr>
         <w:pStyle w:val="Heading3"/>
@@ -11459,9 +11627,9 @@
         </w:pict>
       </w:r>
     </w:p>
-    <w:bookmarkEnd w:id="24"/>
     <w:bookmarkEnd w:id="25"/>
-    <w:bookmarkStart w:id="30" w:name="personas"/>
+    <w:bookmarkEnd w:id="26"/>
+    <w:bookmarkStart w:id="31" w:name="personas"/>
     <w:p>
       <w:pPr>
         <w:pStyle w:val="Heading2"/>
@@ -11470,7 +11638,7 @@
         <w:t xml:space="preserve">2. Personas</w:t>
       </w:r>
     </w:p>
-    <w:bookmarkStart w:id="26" w:name="athlete-1"/>
+    <w:bookmarkStart w:id="27" w:name="athlete-1"/>
     <w:p>
       <w:pPr>
         <w:pStyle w:val="Heading3"/>
@@ -11552,8 +11720,8 @@
         <w:t xml:space="preserve">: can only see/act on their own athlete record</w:t>
       </w:r>
     </w:p>
-    <w:bookmarkEnd w:id="26"/>
-    <w:bookmarkStart w:id="27" w:name="manager"/>
+    <w:bookmarkEnd w:id="27"/>
+    <w:bookmarkStart w:id="28" w:name="manager"/>
     <w:p>
       <w:pPr>
         <w:pStyle w:val="Heading3"/>
@@ -11644,8 +11812,8 @@
         <w:t xml:space="preserve">athlete.managerId = user.id</w:t>
       </w:r>
     </w:p>
-    <w:bookmarkEnd w:id="27"/>
-    <w:bookmarkStart w:id="28" w:name="collaborator-selector"/>
+    <w:bookmarkEnd w:id="28"/>
+    <w:bookmarkStart w:id="29" w:name="collaborator-selector"/>
     <w:p>
       <w:pPr>
         <w:pStyle w:val="Heading3"/>
@@ -11712,8 +11880,8 @@
         <w:t xml:space="preserve">: can view all applications, manage negotiation/agreements, update athlete data</w:t>
       </w:r>
     </w:p>
-    <w:bookmarkEnd w:id="28"/>
-    <w:bookmarkStart w:id="29" w:name="committee-administrator"/>
+    <w:bookmarkEnd w:id="29"/>
+    <w:bookmarkStart w:id="30" w:name="committee-administrator"/>
     <w:p>
       <w:pPr>
         <w:pStyle w:val="Heading3"/>
@@ -11787,9 +11955,9 @@
         </w:pict>
       </w:r>
     </w:p>
-    <w:bookmarkEnd w:id="29"/>
     <w:bookmarkEnd w:id="30"/>
-    <w:bookmarkStart w:id="34" w:name="state-machines"/>
+    <w:bookmarkEnd w:id="31"/>
+    <w:bookmarkStart w:id="35" w:name="state-machines"/>
     <w:p>
       <w:pPr>
         <w:pStyle w:val="Heading2"/>
@@ -11798,7 +11966,7 @@
         <w:t xml:space="preserve">3. State Machines</w:t>
       </w:r>
     </w:p>
-    <w:bookmarkStart w:id="31" w:name="negotiation-status-athlete-level"/>
+    <w:bookmarkStart w:id="32" w:name="negotiation-status-athlete-level"/>
     <w:p>
       <w:pPr>
         <w:pStyle w:val="Heading3"/>
@@ -12399,8 +12567,8 @@
         </w:tc>
       </w:tr>
     </w:tbl>
-    <w:bookmarkEnd w:id="31"/>
-    <w:bookmarkStart w:id="32" w:name="participation-status-application-level"/>
+    <w:bookmarkEnd w:id="32"/>
+    <w:bookmarkStart w:id="33" w:name="participation-status-application-level"/>
     <w:p>
       <w:pPr>
         <w:pStyle w:val="Heading3"/>
@@ -12615,8 +12783,8 @@
         <w:t xml:space="preserve">Reversible — not terminal.</w:t>
       </w:r>
     </w:p>
-    <w:bookmarkEnd w:id="32"/>
-    <w:bookmarkStart w:id="33" w:name="business-rules"/>
+    <w:bookmarkEnd w:id="33"/>
+    <w:bookmarkStart w:id="34" w:name="business-rules"/>
     <w:p>
       <w:pPr>
         <w:pStyle w:val="Heading3"/>
@@ -12790,9 +12958,9 @@
         </w:pict>
       </w:r>
     </w:p>
-    <w:bookmarkEnd w:id="33"/>
     <w:bookmarkEnd w:id="34"/>
-    <w:bookmarkStart w:id="66" w:name="workflows-by-persona"/>
+    <w:bookmarkEnd w:id="35"/>
+    <w:bookmarkStart w:id="67" w:name="workflows-by-persona"/>
     <w:p>
       <w:pPr>
         <w:pStyle w:val="Heading2"/>
@@ -12801,7 +12969,7 @@
         <w:t xml:space="preserve">4. Workflows by Persona</w:t>
       </w:r>
     </w:p>
-    <w:bookmarkStart w:id="42" w:name="athlete-workflows"/>
+    <w:bookmarkStart w:id="43" w:name="athlete-workflows"/>
     <w:p>
       <w:pPr>
         <w:pStyle w:val="Heading3"/>
@@ -12810,7 +12978,7 @@
         <w:t xml:space="preserve">4.1 Athlete Workflows</w:t>
       </w:r>
     </w:p>
-    <w:bookmarkStart w:id="35" w:name="self-registration"/>
+    <w:bookmarkStart w:id="36" w:name="self-registration"/>
     <w:p>
       <w:pPr>
         <w:pStyle w:val="Heading4"/>
@@ -12999,8 +13167,8 @@
         <w:t xml:space="preserve">: athleteId, applicationIds[], magicLinkSent flag</w:t>
       </w:r>
     </w:p>
-    <w:bookmarkEnd w:id="35"/>
-    <w:bookmarkStart w:id="36" w:name="view-athlete-record"/>
+    <w:bookmarkEnd w:id="36"/>
+    <w:bookmarkStart w:id="37" w:name="view-athlete-record"/>
     <w:p>
       <w:pPr>
         <w:pStyle w:val="Heading4"/>
@@ -13061,8 +13229,8 @@
         <w:t xml:space="preserve">hidden), interaction history</w:t>
       </w:r>
     </w:p>
-    <w:bookmarkEnd w:id="36"/>
-    <w:bookmarkStart w:id="37" w:name="update-athlete-record"/>
+    <w:bookmarkEnd w:id="37"/>
+    <w:bookmarkStart w:id="38" w:name="update-athlete-record"/>
     <w:p>
       <w:pPr>
         <w:pStyle w:val="Heading4"/>
@@ -13142,8 +13310,8 @@
         <w:t xml:space="preserve">set to current user</w:t>
       </w:r>
     </w:p>
-    <w:bookmarkEnd w:id="37"/>
-    <w:bookmarkStart w:id="38" w:name="accept-offer"/>
+    <w:bookmarkEnd w:id="38"/>
+    <w:bookmarkStart w:id="39" w:name="accept-offer"/>
     <w:p>
       <w:pPr>
         <w:pStyle w:val="Heading4"/>
@@ -13313,8 +13481,8 @@
         <w:t xml:space="preserve">edition.notificationEmail</w:t>
       </w:r>
     </w:p>
-    <w:bookmarkEnd w:id="38"/>
-    <w:bookmarkStart w:id="39" w:name="reject-offer"/>
+    <w:bookmarkEnd w:id="39"/>
+    <w:bookmarkStart w:id="40" w:name="reject-offer"/>
     <w:p>
       <w:pPr>
         <w:pStyle w:val="Heading4"/>
@@ -13406,8 +13574,8 @@
         <w:t xml:space="preserve">rejected</w:t>
       </w:r>
     </w:p>
-    <w:bookmarkEnd w:id="39"/>
-    <w:bookmarkStart w:id="40" w:name="withdraw"/>
+    <w:bookmarkEnd w:id="40"/>
+    <w:bookmarkStart w:id="41" w:name="withdraw"/>
     <w:p>
       <w:pPr>
         <w:pStyle w:val="Heading4"/>
@@ -13538,8 +13706,8 @@
         <w:t xml:space="preserve">withdrawn</w:t>
       </w:r>
     </w:p>
-    <w:bookmarkEnd w:id="40"/>
-    <w:bookmarkStart w:id="41" w:name="submit-counter-offer"/>
+    <w:bookmarkEnd w:id="41"/>
+    <w:bookmarkStart w:id="42" w:name="submit-counter-offer"/>
     <w:p>
       <w:pPr>
         <w:pStyle w:val="Heading4"/>
@@ -13761,9 +13929,9 @@
         <w:t xml:space="preserve">edition.notificationEmail</w:t>
       </w:r>
     </w:p>
-    <w:bookmarkEnd w:id="41"/>
     <w:bookmarkEnd w:id="42"/>
-    <w:bookmarkStart w:id="47" w:name="manager-workflows"/>
+    <w:bookmarkEnd w:id="43"/>
+    <w:bookmarkStart w:id="48" w:name="manager-workflows"/>
     <w:p>
       <w:pPr>
         <w:pStyle w:val="Heading3"/>
@@ -13772,7 +13940,7 @@
         <w:t xml:space="preserve">4.2 Manager Workflows</w:t>
       </w:r>
     </w:p>
-    <w:bookmarkStart w:id="43" w:name="self-registration-1"/>
+    <w:bookmarkStart w:id="44" w:name="self-registration-1"/>
     <w:p>
       <w:pPr>
         <w:pStyle w:val="Heading4"/>
@@ -13892,8 +14060,8 @@
         <w:t xml:space="preserve">: userId, token</w:t>
       </w:r>
     </w:p>
-    <w:bookmarkEnd w:id="43"/>
-    <w:bookmarkStart w:id="44" w:name="batch-register-athletes"/>
+    <w:bookmarkEnd w:id="44"/>
+    <w:bookmarkStart w:id="45" w:name="batch-register-athletes"/>
     <w:p>
       <w:pPr>
         <w:pStyle w:val="Heading4"/>
@@ -14036,8 +14204,8 @@
         <w:t xml:space="preserve">- Sends summary email to manager</w:t>
       </w:r>
     </w:p>
-    <w:bookmarkEnd w:id="44"/>
-    <w:bookmarkStart w:id="45" w:name="view-manager-portal"/>
+    <w:bookmarkEnd w:id="45"/>
+    <w:bookmarkStart w:id="46" w:name="view-manager-portal"/>
     <w:p>
       <w:pPr>
         <w:pStyle w:val="Heading4"/>
@@ -14095,8 +14263,8 @@
         <w:t xml:space="preserve">, with applications, events, agreements, and KPI summary (total, toReview, inNegotiation, confirmed, rejected)</w:t>
       </w:r>
     </w:p>
-    <w:bookmarkEnd w:id="45"/>
-    <w:bookmarkStart w:id="46" w:name="act-on-behalf-of-athlete"/>
+    <w:bookmarkEnd w:id="46"/>
+    <w:bookmarkStart w:id="47" w:name="act-on-behalf-of-athlete"/>
     <w:p>
       <w:pPr>
         <w:pStyle w:val="Heading4"/>
@@ -14125,9 +14293,9 @@
         <w:t xml:space="preserve">, including viewing and updating athlete records. Same endpoints, same effects.</w:t>
       </w:r>
     </w:p>
-    <w:bookmarkEnd w:id="46"/>
     <w:bookmarkEnd w:id="47"/>
-    <w:bookmarkStart w:id="57" w:name="collaborator-workflows"/>
+    <w:bookmarkEnd w:id="48"/>
+    <w:bookmarkStart w:id="58" w:name="collaborator-workflows"/>
     <w:p>
       <w:pPr>
         <w:pStyle w:val="Heading3"/>
@@ -14136,7 +14304,7 @@
         <w:t xml:space="preserve">4.3 Collaborator Workflows</w:t>
       </w:r>
     </w:p>
-    <w:bookmarkStart w:id="48" w:name="view-candidates"/>
+    <w:bookmarkStart w:id="49" w:name="view-candidates"/>
     <w:p>
       <w:pPr>
         <w:pStyle w:val="Heading4"/>
@@ -14233,8 +14401,8 @@
         <w:t xml:space="preserve">: all applications with athlete details, event details, PB/SB/ranking (from application working copy), score, ordered by score descending</w:t>
       </w:r>
     </w:p>
-    <w:bookmarkEnd w:id="48"/>
-    <w:bookmarkStart w:id="49" w:name="view-application-detail"/>
+    <w:bookmarkEnd w:id="49"/>
+    <w:bookmarkStart w:id="50" w:name="view-application-detail"/>
     <w:p>
       <w:pPr>
         <w:pStyle w:val="Heading4"/>
@@ -14280,8 +14448,8 @@
         <w:t xml:space="preserve">: full application + athlete + event + all agreements (athlete-level) + interactions + WA performance</w:t>
       </w:r>
     </w:p>
-    <w:bookmarkEnd w:id="49"/>
-    <w:bookmarkStart w:id="50" w:name="change-negotiation-status"/>
+    <w:bookmarkEnd w:id="50"/>
+    <w:bookmarkStart w:id="51" w:name="change-negotiation-status"/>
     <w:p>
       <w:pPr>
         <w:pStyle w:val="Heading4"/>
@@ -14424,8 +14592,8 @@
         <w:t xml:space="preserve">- Email to athlete + manager (if exists)</w:t>
       </w:r>
     </w:p>
-    <w:bookmarkEnd w:id="50"/>
-    <w:bookmarkStart w:id="51" w:name="send-agreement"/>
+    <w:bookmarkEnd w:id="51"/>
+    <w:bookmarkStart w:id="52" w:name="send-agreement"/>
     <w:p>
       <w:pPr>
         <w:pStyle w:val="Heading4"/>
@@ -14657,8 +14825,8 @@
         <w:t xml:space="preserve">- Email to athlete (+ manager if exists) with offer summary</w:t>
       </w:r>
     </w:p>
-    <w:bookmarkEnd w:id="51"/>
-    <w:bookmarkStart w:id="52" w:name="change-participation-status"/>
+    <w:bookmarkEnd w:id="52"/>
+    <w:bookmarkStart w:id="53" w:name="change-participation-status"/>
     <w:p>
       <w:pPr>
         <w:pStyle w:val="Heading4"/>
@@ -14774,8 +14942,8 @@
         <w:t xml:space="preserve">logged</w:t>
       </w:r>
     </w:p>
-    <w:bookmarkEnd w:id="52"/>
-    <w:bookmarkStart w:id="53" w:name="update-athlete-data"/>
+    <w:bookmarkEnd w:id="53"/>
+    <w:bookmarkStart w:id="54" w:name="update-athlete-data"/>
     <w:p>
       <w:pPr>
         <w:pStyle w:val="Heading4"/>
@@ -14864,8 +15032,8 @@
         <w:t xml:space="preserve">set to current user</w:t>
       </w:r>
     </w:p>
-    <w:bookmarkEnd w:id="53"/>
-    <w:bookmarkStart w:id="54" w:name="add-interaction"/>
+    <w:bookmarkEnd w:id="54"/>
+    <w:bookmarkStart w:id="55" w:name="add-interaction"/>
     <w:p>
       <w:pPr>
         <w:pStyle w:val="Heading4"/>
@@ -14987,8 +15155,8 @@
         <w:t xml:space="preserve">row created at athlete level (optionally linked to application)</w:t>
       </w:r>
     </w:p>
-    <w:bookmarkEnd w:id="54"/>
-    <w:bookmarkStart w:id="55" w:name="upsert-wa-performance"/>
+    <w:bookmarkEnd w:id="55"/>
+    <w:bookmarkStart w:id="56" w:name="upsert-wa-performance"/>
     <w:p>
       <w:pPr>
         <w:pStyle w:val="Heading4"/>
@@ -15097,8 +15265,8 @@
         <w:t xml:space="preserve">- Auto-recomputes score for that application</w:t>
       </w:r>
     </w:p>
-    <w:bookmarkEnd w:id="55"/>
-    <w:bookmarkStart w:id="56" w:name="archive-athlete"/>
+    <w:bookmarkEnd w:id="56"/>
+    <w:bookmarkStart w:id="57" w:name="archive-athlete"/>
     <w:p>
       <w:pPr>
         <w:pStyle w:val="Heading4"/>
@@ -15199,9 +15367,9 @@
         <w:t xml:space="preserve">archivedAt</w:t>
       </w:r>
     </w:p>
-    <w:bookmarkEnd w:id="56"/>
     <w:bookmarkEnd w:id="57"/>
-    <w:bookmarkStart w:id="65" w:name="committee-workflows"/>
+    <w:bookmarkEnd w:id="58"/>
+    <w:bookmarkStart w:id="66" w:name="committee-workflows"/>
     <w:p>
       <w:pPr>
         <w:pStyle w:val="Heading3"/>
@@ -15218,7 +15386,7 @@
         <w:t xml:space="preserve">Committee has all collaborator capabilities (4.3.1–4.3.9), plus:</w:t>
       </w:r>
     </w:p>
-    <w:bookmarkStart w:id="58" w:name="view-dashboard"/>
+    <w:bookmarkStart w:id="59" w:name="view-dashboard"/>
     <w:p>
       <w:pPr>
         <w:pStyle w:val="Heading4"/>
@@ -15443,8 +15611,8 @@
         <w:t xml:space="preserve">- total assigned athletes, by negotiation status</w:t>
       </w:r>
     </w:p>
-    <w:bookmarkEnd w:id="58"/>
-    <w:bookmarkStart w:id="59" w:name="create-event"/>
+    <w:bookmarkEnd w:id="59"/>
+    <w:bookmarkStart w:id="60" w:name="create-event"/>
     <w:p>
       <w:pPr>
         <w:pStyle w:val="Heading4"/>
@@ -15518,8 +15686,8 @@
         <w:t xml:space="preserve">row created linked to catalog entry</w:t>
       </w:r>
     </w:p>
-    <w:bookmarkEnd w:id="59"/>
-    <w:bookmarkStart w:id="60" w:name="update-event"/>
+    <w:bookmarkEnd w:id="60"/>
+    <w:bookmarkStart w:id="61" w:name="update-event"/>
     <w:p>
       <w:pPr>
         <w:pStyle w:val="Heading4"/>
@@ -15593,8 +15761,8 @@
         <w:t xml:space="preserve">row updated</w:t>
       </w:r>
     </w:p>
-    <w:bookmarkEnd w:id="60"/>
-    <w:bookmarkStart w:id="61" w:name="manage-edition-configuration"/>
+    <w:bookmarkEnd w:id="61"/>
+    <w:bookmarkStart w:id="62" w:name="manage-edition-configuration"/>
     <w:p>
       <w:pPr>
         <w:pStyle w:val="Heading4"/>
@@ -15672,8 +15840,8 @@
         <w:t xml:space="preserve">row updated</w:t>
       </w:r>
     </w:p>
-    <w:bookmarkEnd w:id="61"/>
-    <w:bookmarkStart w:id="62" w:name="manage-hotels-room-types"/>
+    <w:bookmarkEnd w:id="62"/>
+    <w:bookmarkStart w:id="63" w:name="manage-hotels-room-types"/>
     <w:p>
       <w:pPr>
         <w:pStyle w:val="Heading4"/>
@@ -15760,8 +15928,8 @@
         <w:t xml:space="preserve">: hotel/hotel_room rows created/updated/deleted</w:t>
       </w:r>
     </w:p>
-    <w:bookmarkEnd w:id="62"/>
-    <w:bookmarkStart w:id="63" w:name="maintain-reference-tables"/>
+    <w:bookmarkEnd w:id="63"/>
+    <w:bookmarkStart w:id="64" w:name="maintain-reference-tables"/>
     <w:p>
       <w:pPr>
         <w:pStyle w:val="Heading4"/>
@@ -15831,8 +15999,8 @@
         <w:t xml:space="preserve">: reference data updated; used in autocomplete and validation throughout the system</w:t>
       </w:r>
     </w:p>
-    <w:bookmarkEnd w:id="63"/>
-    <w:bookmarkStart w:id="64" w:name="view-email-log"/>
+    <w:bookmarkEnd w:id="64"/>
+    <w:bookmarkStart w:id="65" w:name="view-email-log"/>
     <w:p>
       <w:pPr>
         <w:pStyle w:val="Heading4"/>
@@ -15885,10 +16053,10 @@
         </w:pict>
       </w:r>
     </w:p>
-    <w:bookmarkEnd w:id="64"/>
     <w:bookmarkEnd w:id="65"/>
     <w:bookmarkEnd w:id="66"/>
-    <w:bookmarkStart w:id="72" w:name="scoring-engine"/>
+    <w:bookmarkEnd w:id="67"/>
+    <w:bookmarkStart w:id="73" w:name="scoring-engine"/>
     <w:p>
       <w:pPr>
         <w:pStyle w:val="Heading2"/>
@@ -15920,7 +16088,7 @@
         <w:t xml:space="preserve">: eventId (to look up minima/discipline from event+catalog), personalBest, seasonBest, worldRanking, estimatedCostTotal, isEap, isSwiss + edition scoring weights</w:t>
       </w:r>
     </w:p>
-    <w:bookmarkStart w:id="67" w:name="performance-format"/>
+    <w:bookmarkStart w:id="68" w:name="performance-format"/>
     <w:p>
       <w:pPr>
         <w:pStyle w:val="Heading3"/>
@@ -15993,8 +16161,8 @@
         <w:t xml:space="preserve">(field events): meters (e.g. 2.39 for high jump)</w:t>
       </w:r>
     </w:p>
-    <w:bookmarkEnd w:id="67"/>
-    <w:bookmarkStart w:id="68" w:name="eligibility"/>
+    <w:bookmarkEnd w:id="68"/>
+    <w:bookmarkStart w:id="69" w:name="eligibility"/>
     <w:p>
       <w:pPr>
         <w:pStyle w:val="Heading3"/>
@@ -16118,8 +16286,8 @@
         <w:t xml:space="preserve">“Not Recommended”</w:t>
       </w:r>
     </w:p>
-    <w:bookmarkEnd w:id="68"/>
-    <w:bookmarkStart w:id="69" w:name="factor-computation"/>
+    <w:bookmarkEnd w:id="69"/>
+    <w:bookmarkStart w:id="70" w:name="factor-computation"/>
     <w:p>
       <w:pPr>
         <w:pStyle w:val="Heading3"/>
@@ -16421,8 +16589,8 @@
         <w:t xml:space="preserve">. This is intentional: the cost reflects athlete-level logistics, not event-specific costs, because the athlete travels once regardless of how many events they compete in.</w:t>
       </w:r>
     </w:p>
-    <w:bookmarkEnd w:id="69"/>
-    <w:bookmarkStart w:id="70" w:name="final-score"/>
+    <w:bookmarkEnd w:id="70"/>
+    <w:bookmarkStart w:id="71" w:name="final-score"/>
     <w:p>
       <w:pPr>
         <w:pStyle w:val="Heading3"/>
@@ -16499,8 +16667,8 @@
         <w:t xml:space="preserve">finalScore = clamp(0, 1, weightedSum + (isEap ? eapBonus : 0))</w:t>
       </w:r>
     </w:p>
-    <w:bookmarkEnd w:id="70"/>
-    <w:bookmarkStart w:id="71" w:name="recommendation-thresholds"/>
+    <w:bookmarkEnd w:id="71"/>
+    <w:bookmarkStart w:id="72" w:name="recommendation-thresholds"/>
     <w:p>
       <w:pPr>
         <w:pStyle w:val="Heading3"/>
@@ -16650,9 +16818,9 @@
         </w:pict>
       </w:r>
     </w:p>
-    <w:bookmarkEnd w:id="71"/>
     <w:bookmarkEnd w:id="72"/>
-    <w:bookmarkStart w:id="73" w:name="access-control-matrix"/>
+    <w:bookmarkEnd w:id="73"/>
+    <w:bookmarkStart w:id="74" w:name="access-control-matrix"/>
     <w:p>
       <w:pPr>
         <w:pStyle w:val="Heading2"/>
@@ -18881,8 +19049,8 @@
         </w:pict>
       </w:r>
     </w:p>
-    <w:bookmarkEnd w:id="73"/>
-    <w:bookmarkStart w:id="74" w:name="email-triggers"/>
+    <w:bookmarkEnd w:id="74"/>
+    <w:bookmarkStart w:id="75" w:name="email-triggers"/>
     <w:p>
       <w:pPr>
         <w:pStyle w:val="Heading2"/>
@@ -19272,8 +19440,8 @@
         </w:pict>
       </w:r>
     </w:p>
-    <w:bookmarkEnd w:id="74"/>
-    <w:bookmarkStart w:id="79" w:name="computed-fields-kpis"/>
+    <w:bookmarkEnd w:id="75"/>
+    <w:bookmarkStart w:id="80" w:name="computed-fields-kpis"/>
     <w:p>
       <w:pPr>
         <w:pStyle w:val="Heading2"/>
@@ -19282,7 +19450,7 @@
         <w:t xml:space="preserve">8. Computed Fields &amp; KPIs</w:t>
       </w:r>
     </w:p>
-    <w:bookmarkStart w:id="75" w:name="athlete-2"/>
+    <w:bookmarkStart w:id="76" w:name="athlete-2"/>
     <w:p>
       <w:pPr>
         <w:pStyle w:val="Heading3"/>
@@ -19353,8 +19521,8 @@
         </w:tc>
       </w:tr>
     </w:tbl>
-    <w:bookmarkEnd w:id="75"/>
-    <w:bookmarkStart w:id="76" w:name="application-1"/>
+    <w:bookmarkEnd w:id="76"/>
+    <w:bookmarkStart w:id="77" w:name="application-1"/>
     <w:p>
       <w:pPr>
         <w:pStyle w:val="Heading3"/>
@@ -19566,8 +19734,8 @@
         </w:tc>
       </w:tr>
     </w:tbl>
-    <w:bookmarkEnd w:id="76"/>
-    <w:bookmarkStart w:id="77" w:name="agreement-1"/>
+    <w:bookmarkEnd w:id="77"/>
+    <w:bookmarkStart w:id="78" w:name="agreement-1"/>
     <w:p>
       <w:pPr>
         <w:pStyle w:val="Heading3"/>
@@ -19662,8 +19830,8 @@
         </w:tc>
       </w:tr>
     </w:tbl>
-    <w:bookmarkEnd w:id="77"/>
-    <w:bookmarkStart w:id="78" w:name="dashboard-kpis"/>
+    <w:bookmarkEnd w:id="78"/>
+    <w:bookmarkStart w:id="79" w:name="dashboard-kpis"/>
     <w:p>
       <w:pPr>
         <w:pStyle w:val="Heading3"/>
@@ -20045,9 +20213,9 @@
         </w:pict>
       </w:r>
     </w:p>
-    <w:bookmarkEnd w:id="78"/>
     <w:bookmarkEnd w:id="79"/>
-    <w:bookmarkStart w:id="80" w:name="authentication"/>
+    <w:bookmarkEnd w:id="80"/>
+    <w:bookmarkStart w:id="81" w:name="authentication"/>
     <w:p>
       <w:pPr>
         <w:pStyle w:val="Heading2"/>
@@ -20182,156 +20350,11 @@
         <w:pStyle w:val="Compact"/>
         <w:numPr>
           <w:ilvl w:val="0"/>
-          <w:numId w:val="1001"/>
+          <w:numId w:val="1002"/>
         </w:numPr>
       </w:pPr>
       <w:r>
         <w:t xml:space="preserve">Sessions expire after 7 days</w:t>
-      </w:r>
-    </w:p>
-    <w:p>
-      <w:pPr>
-        <w:pStyle w:val="Compact"/>
-        <w:numPr>
-          <w:ilvl w:val="0"/>
-          <w:numId w:val="1001"/>
-        </w:numPr>
-      </w:pPr>
-      <w:r>
-        <w:t xml:space="preserve">Magic links expire after 30 minutes, single-use</w:t>
-      </w:r>
-    </w:p>
-    <w:p>
-      <w:pPr>
-        <w:pStyle w:val="Compact"/>
-        <w:numPr>
-          <w:ilvl w:val="0"/>
-          <w:numId w:val="1001"/>
-        </w:numPr>
-      </w:pPr>
-      <w:r>
-        <w:t xml:space="preserve">Password hashing: PBKDF2-SHA256, 100k iterations</w:t>
-      </w:r>
-    </w:p>
-    <w:p>
-      <w:r>
-        <w:pict>
-          <v:rect style="width:0;height:1.5pt" o:hralign="center" o:hrstd="t" o:hr="t"/>
-        </w:pict>
-      </w:r>
-    </w:p>
-    <w:bookmarkEnd w:id="80"/>
-    <w:bookmarkStart w:id="81" w:name="internationalization"/>
-    <w:p>
-      <w:pPr>
-        <w:pStyle w:val="Heading2"/>
-      </w:pPr>
-      <w:r>
-        <w:t xml:space="preserve">10. Internationalization</w:t>
-      </w:r>
-    </w:p>
-    <w:p>
-      <w:pPr>
-        <w:pStyle w:val="FirstParagraph"/>
-      </w:pPr>
-      <w:r>
-        <w:rPr>
-          <w:b/>
-          <w:bCs/>
-        </w:rPr>
-        <w:t xml:space="preserve">Languages</w:t>
-      </w:r>
-      <w:r>
-        <w:t xml:space="preserve">: English (en), French (fr)</w:t>
-      </w:r>
-      <w:r>
-        <w:t xml:space="preserve"> </w:t>
-      </w:r>
-      <w:r>
-        <w:rPr>
-          <w:b/>
-          <w:bCs/>
-        </w:rPr>
-        <w:t xml:space="preserve">Storage</w:t>
-      </w:r>
-      <w:r>
-        <w:t xml:space="preserve">:</w:t>
-      </w:r>
-      <w:r>
-        <w:t xml:space="preserve"> </w:t>
-      </w:r>
-      <w:r>
-        <w:rPr>
-          <w:rStyle w:val="VerbatimChar"/>
-        </w:rPr>
-        <w:t xml:space="preserve">user.preferredLang</w:t>
-      </w:r>
-      <w:r>
-        <w:t xml:space="preserve"> </w:t>
-      </w:r>
-      <w:r>
-        <w:t xml:space="preserve">+</w:t>
-      </w:r>
-      <w:r>
-        <w:t xml:space="preserve"> </w:t>
-      </w:r>
-      <w:r>
-        <w:rPr>
-          <w:rStyle w:val="VerbatimChar"/>
-        </w:rPr>
-        <w:t xml:space="preserve">localStorage('lang')</w:t>
-      </w:r>
-      <w:r>
-        <w:t xml:space="preserve"> </w:t>
-      </w:r>
-      <w:r>
-        <w:rPr>
-          <w:b/>
-          <w:bCs/>
-        </w:rPr>
-        <w:t xml:space="preserve">Scope</w:t>
-      </w:r>
-      <w:r>
-        <w:t xml:space="preserve">: all UI labels, status names, form fields, email content</w:t>
-      </w:r>
-      <w:r>
-        <w:t xml:space="preserve"> </w:t>
-      </w:r>
-      <w:r>
-        <w:rPr>
-          <w:b/>
-          <w:bCs/>
-        </w:rPr>
-        <w:t xml:space="preserve">Currency</w:t>
-      </w:r>
-      <w:r>
-        <w:t xml:space="preserve">: displayed dynamically from</w:t>
-      </w:r>
-      <w:r>
-        <w:t xml:space="preserve"> </w:t>
-      </w:r>
-      <w:r>
-        <w:rPr>
-          <w:rStyle w:val="VerbatimChar"/>
-        </w:rPr>
-        <w:t xml:space="preserve">edition.currency</w:t>
-      </w:r>
-    </w:p>
-    <w:p>
-      <w:r>
-        <w:pict>
-          <v:rect style="width:0;height:1.5pt" o:hralign="center" o:hrstd="t" o:hr="t"/>
-        </w:pict>
-      </w:r>
-    </w:p>
-    <w:bookmarkEnd w:id="81"/>
-    <w:bookmarkStart w:id="82" w:name="known-limitations"/>
-    <w:p>
-      <w:pPr>
-        <w:pStyle w:val="Heading2"/>
-      </w:pPr>
-      <w:r>
-        <w:t xml:space="preserve">11. Known Limitations</w:t>
       </w:r>
     </w:p>
     <w:p>
@@ -20343,17 +20366,7 @@
         </w:numPr>
       </w:pPr>
       <w:r>
-        <w:rPr>
-          <w:b/>
-          <w:bCs/>
-        </w:rPr>
-        <w:t xml:space="preserve">WA Performance is manual</w:t>
-      </w:r>
-      <w:r>
-        <w:t xml:space="preserve"> </w:t>
-      </w:r>
-      <w:r>
-        <w:t xml:space="preserve">— PB/SB/ranking must be entered by collaborators. No automated import from World Athletics yet.</w:t>
+        <w:t xml:space="preserve">Magic links expire after 30 minutes, single-use</w:t>
       </w:r>
     </w:p>
     <w:p>
@@ -20365,17 +20378,52 @@
         </w:numPr>
       </w:pPr>
       <w:r>
+        <w:t xml:space="preserve">Password hashing: PBKDF2-SHA256, 100k iterations</w:t>
+      </w:r>
+    </w:p>
+    <w:p>
+      <w:r>
+        <w:pict>
+          <v:rect style="width:0;height:1.5pt" o:hralign="center" o:hrstd="t" o:hr="t"/>
+        </w:pict>
+      </w:r>
+    </w:p>
+    <w:bookmarkEnd w:id="81"/>
+    <w:bookmarkStart w:id="82" w:name="internationalization"/>
+    <w:p>
+      <w:pPr>
+        <w:pStyle w:val="Heading2"/>
+      </w:pPr>
+      <w:r>
+        <w:t xml:space="preserve">10. Internationalization</w:t>
+      </w:r>
+    </w:p>
+    <w:p>
+      <w:pPr>
+        <w:pStyle w:val="FirstParagraph"/>
+      </w:pPr>
+      <w:r>
         <w:rPr>
           <w:b/>
           <w:bCs/>
         </w:rPr>
-        <w:t xml:space="preserve">Single edition</w:t>
-      </w:r>
-      <w:r>
-        <w:t xml:space="preserve"> </w:t>
-      </w:r>
-      <w:r>
-        <w:t xml:space="preserve">— the system always uses</w:t>
+        <w:t xml:space="preserve">Languages</w:t>
+      </w:r>
+      <w:r>
+        <w:t xml:space="preserve">: English (en), French (fr)</w:t>
+      </w:r>
+      <w:r>
+        <w:t xml:space="preserve"> </w:t>
+      </w:r>
+      <w:r>
+        <w:rPr>
+          <w:b/>
+          <w:bCs/>
+        </w:rPr>
+        <w:t xml:space="preserve">Storage</w:t>
+      </w:r>
+      <w:r>
+        <w:t xml:space="preserve">:</w:t>
       </w:r>
       <w:r>
         <w:t xml:space="preserve"> </w:t>
@@ -20384,13 +20432,74 @@
         <w:rPr>
           <w:rStyle w:val="VerbatimChar"/>
         </w:rPr>
-        <w:t xml:space="preserve">LIMIT 1</w:t>
-      </w:r>
-      <w:r>
-        <w:t xml:space="preserve"> </w:t>
-      </w:r>
-      <w:r>
-        <w:t xml:space="preserve">on the edition table. Multi-edition support is not implemented.</w:t>
+        <w:t xml:space="preserve">user.preferredLang</w:t>
+      </w:r>
+      <w:r>
+        <w:t xml:space="preserve"> </w:t>
+      </w:r>
+      <w:r>
+        <w:t xml:space="preserve">+</w:t>
+      </w:r>
+      <w:r>
+        <w:t xml:space="preserve"> </w:t>
+      </w:r>
+      <w:r>
+        <w:rPr>
+          <w:rStyle w:val="VerbatimChar"/>
+        </w:rPr>
+        <w:t xml:space="preserve">localStorage('lang')</w:t>
+      </w:r>
+      <w:r>
+        <w:t xml:space="preserve"> </w:t>
+      </w:r>
+      <w:r>
+        <w:rPr>
+          <w:b/>
+          <w:bCs/>
+        </w:rPr>
+        <w:t xml:space="preserve">Scope</w:t>
+      </w:r>
+      <w:r>
+        <w:t xml:space="preserve">: all UI labels, status names, form fields, email content</w:t>
+      </w:r>
+      <w:r>
+        <w:t xml:space="preserve"> </w:t>
+      </w:r>
+      <w:r>
+        <w:rPr>
+          <w:b/>
+          <w:bCs/>
+        </w:rPr>
+        <w:t xml:space="preserve">Currency</w:t>
+      </w:r>
+      <w:r>
+        <w:t xml:space="preserve">: displayed dynamically from</w:t>
+      </w:r>
+      <w:r>
+        <w:t xml:space="preserve"> </w:t>
+      </w:r>
+      <w:r>
+        <w:rPr>
+          <w:rStyle w:val="VerbatimChar"/>
+        </w:rPr>
+        <w:t xml:space="preserve">edition.currency</w:t>
+      </w:r>
+    </w:p>
+    <w:p>
+      <w:r>
+        <w:pict>
+          <v:rect style="width:0;height:1.5pt" o:hralign="center" o:hrstd="t" o:hr="t"/>
+        </w:pict>
+      </w:r>
+    </w:p>
+    <w:bookmarkEnd w:id="82"/>
+    <w:bookmarkStart w:id="83" w:name="known-limitations"/>
+    <w:p>
+      <w:pPr>
+        <w:pStyle w:val="Heading2"/>
+      </w:pPr>
+      <w:r>
+        <w:t xml:space="preserve">11. Known Limitations</w:t>
       </w:r>
     </w:p>
     <w:p>
@@ -20398,7 +20507,7 @@
         <w:pStyle w:val="Compact"/>
         <w:numPr>
           <w:ilvl w:val="0"/>
-          <w:numId w:val="1002"/>
+          <w:numId w:val="1003"/>
         </w:numPr>
       </w:pPr>
       <w:r>
@@ -20406,13 +20515,13 @@
           <w:b/>
           <w:bCs/>
         </w:rPr>
-        <w:t xml:space="preserve">No file uploads</w:t>
-      </w:r>
-      <w:r>
-        <w:t xml:space="preserve"> </w:t>
-      </w:r>
-      <w:r>
-        <w:t xml:space="preserve">— no passport photos, signed agreements, or PDF exports.</w:t>
+        <w:t xml:space="preserve">WA Performance is manual</w:t>
+      </w:r>
+      <w:r>
+        <w:t xml:space="preserve"> </w:t>
+      </w:r>
+      <w:r>
+        <w:t xml:space="preserve">— PB/SB/ranking must be entered by collaborators. No automated import from World Athletics yet.</w:t>
       </w:r>
     </w:p>
     <w:p>
@@ -20420,7 +20529,7 @@
         <w:pStyle w:val="Compact"/>
         <w:numPr>
           <w:ilvl w:val="0"/>
-          <w:numId w:val="1002"/>
+          <w:numId w:val="1003"/>
         </w:numPr>
       </w:pPr>
       <w:r>
@@ -20428,6 +20537,65 @@
           <w:b/>
           <w:bCs/>
         </w:rPr>
+        <w:t xml:space="preserve">Single edition</w:t>
+      </w:r>
+      <w:r>
+        <w:t xml:space="preserve"> </w:t>
+      </w:r>
+      <w:r>
+        <w:t xml:space="preserve">— the system always uses</w:t>
+      </w:r>
+      <w:r>
+        <w:t xml:space="preserve"> </w:t>
+      </w:r>
+      <w:r>
+        <w:rPr>
+          <w:rStyle w:val="VerbatimChar"/>
+        </w:rPr>
+        <w:t xml:space="preserve">LIMIT 1</w:t>
+      </w:r>
+      <w:r>
+        <w:t xml:space="preserve"> </w:t>
+      </w:r>
+      <w:r>
+        <w:t xml:space="preserve">on the edition table. Multi-edition support is not implemented.</w:t>
+      </w:r>
+    </w:p>
+    <w:p>
+      <w:pPr>
+        <w:pStyle w:val="Compact"/>
+        <w:numPr>
+          <w:ilvl w:val="0"/>
+          <w:numId w:val="1003"/>
+        </w:numPr>
+      </w:pPr>
+      <w:r>
+        <w:rPr>
+          <w:b/>
+          <w:bCs/>
+        </w:rPr>
+        <w:t xml:space="preserve">No file uploads</w:t>
+      </w:r>
+      <w:r>
+        <w:t xml:space="preserve"> </w:t>
+      </w:r>
+      <w:r>
+        <w:t xml:space="preserve">— no passport photos, signed agreements, or PDF exports.</w:t>
+      </w:r>
+    </w:p>
+    <w:p>
+      <w:pPr>
+        <w:pStyle w:val="Compact"/>
+        <w:numPr>
+          <w:ilvl w:val="0"/>
+          <w:numId w:val="1003"/>
+        </w:numPr>
+      </w:pPr>
+      <w:r>
+        <w:rPr>
+          <w:b/>
+          <w:bCs/>
+        </w:rPr>
         <w:t xml:space="preserve">Agreement totalCost is visible to collaborators/committee but hidden from athletes/managers</w:t>
       </w:r>
       <w:r>
@@ -20437,8 +20605,8 @@
         <w:t xml:space="preserve">in the portal.</w:t>
       </w:r>
     </w:p>
-    <w:bookmarkEnd w:id="82"/>
     <w:bookmarkEnd w:id="83"/>
+    <w:bookmarkEnd w:id="84"/>
     <w:sectPr>
       <w:footnotePr>
         <w:numRestart w:val="eachSect"/>
@@ -20543,6 +20711,91 @@
     <w:lvl w:ilvl="8">
       <w:numFmt w:val="bullet"/>
       <w:lvlText w:val=" "/>
+      <w:lvlJc w:val="left"/>
+      <w:pPr>
+        <w:ind w:left="6480" w:hanging="360"/>
+      </w:pPr>
+    </w:lvl>
+  </w:abstractNum>
+  <w:abstractNum w:abstractNumId="99411">
+    <w:nsid w:val="00A99411"/>
+    <w:multiLevelType w:val="multilevel"/>
+    <w:lvl w:ilvl="0">
+      <w:start w:val="1"/>
+      <w:numFmt w:val="decimal"/>
+      <w:lvlText w:val="%1."/>
+      <w:lvlJc w:val="left"/>
+      <w:pPr>
+        <w:ind w:left="720" w:hanging="360"/>
+      </w:pPr>
+    </w:lvl>
+    <w:lvl w:ilvl="1">
+      <w:start w:val="1"/>
+      <w:numFmt w:val="decimal"/>
+      <w:lvlText w:val="%2."/>
+      <w:lvlJc w:val="left"/>
+      <w:pPr>
+        <w:ind w:left="1440" w:hanging="360"/>
+      </w:pPr>
+    </w:lvl>
+    <w:lvl w:ilvl="2">
+      <w:start w:val="1"/>
+      <w:numFmt w:val="decimal"/>
+      <w:lvlText w:val="%3."/>
+      <w:lvlJc w:val="left"/>
+      <w:pPr>
+        <w:ind w:left="2160" w:hanging="360"/>
+      </w:pPr>
+    </w:lvl>
+    <w:lvl w:ilvl="3">
+      <w:start w:val="1"/>
+      <w:numFmt w:val="decimal"/>
+      <w:lvlText w:val="%4."/>
+      <w:lvlJc w:val="left"/>
+      <w:pPr>
+        <w:ind w:left="2880" w:hanging="360"/>
+      </w:pPr>
+    </w:lvl>
+    <w:lvl w:ilvl="4">
+      <w:start w:val="1"/>
+      <w:numFmt w:val="decimal"/>
+      <w:lvlText w:val="%5."/>
+      <w:lvlJc w:val="left"/>
+      <w:pPr>
+        <w:ind w:left="3600" w:hanging="360"/>
+      </w:pPr>
+    </w:lvl>
+    <w:lvl w:ilvl="5">
+      <w:start w:val="1"/>
+      <w:numFmt w:val="decimal"/>
+      <w:lvlText w:val="%6."/>
+      <w:lvlJc w:val="left"/>
+      <w:pPr>
+        <w:ind w:left="4320" w:hanging="360"/>
+      </w:pPr>
+    </w:lvl>
+    <w:lvl w:ilvl="6">
+      <w:start w:val="1"/>
+      <w:numFmt w:val="decimal"/>
+      <w:lvlText w:val="%7."/>
+      <w:lvlJc w:val="left"/>
+      <w:pPr>
+        <w:ind w:left="5040" w:hanging="360"/>
+      </w:pPr>
+    </w:lvl>
+    <w:lvl w:ilvl="7">
+      <w:start w:val="1"/>
+      <w:numFmt w:val="decimal"/>
+      <w:lvlText w:val="%8."/>
+      <w:lvlJc w:val="left"/>
+      <w:pPr>
+        <w:ind w:left="5760" w:hanging="360"/>
+      </w:pPr>
+    </w:lvl>
+    <w:lvl w:ilvl="8">
+      <w:start w:val="1"/>
+      <w:numFmt w:val="decimal"/>
+      <w:lvlText w:val="%9."/>
       <w:lvlJc w:val="left"/>
       <w:pPr>
         <w:ind w:left="6480" w:hanging="360"/>
@@ -20652,98 +20905,43 @@
       </w:rPr>
     </w:lvl>
   </w:abstractNum>
-  <w:abstractNum w:abstractNumId="99411">
-    <w:nsid w:val="00A99411"/>
-    <w:multiLevelType w:val="multilevel"/>
-    <w:lvl w:ilvl="0">
-      <w:start w:val="1"/>
-      <w:numFmt w:val="decimal"/>
-      <w:lvlText w:val="%1."/>
-      <w:lvlJc w:val="left"/>
-      <w:pPr>
-        <w:ind w:left="720" w:hanging="360"/>
-      </w:pPr>
-    </w:lvl>
-    <w:lvl w:ilvl="1">
-      <w:start w:val="1"/>
-      <w:numFmt w:val="decimal"/>
-      <w:lvlText w:val="%2."/>
-      <w:lvlJc w:val="left"/>
-      <w:pPr>
-        <w:ind w:left="1440" w:hanging="360"/>
-      </w:pPr>
-    </w:lvl>
-    <w:lvl w:ilvl="2">
-      <w:start w:val="1"/>
-      <w:numFmt w:val="decimal"/>
-      <w:lvlText w:val="%3."/>
-      <w:lvlJc w:val="left"/>
-      <w:pPr>
-        <w:ind w:left="2160" w:hanging="360"/>
-      </w:pPr>
-    </w:lvl>
-    <w:lvl w:ilvl="3">
-      <w:start w:val="1"/>
-      <w:numFmt w:val="decimal"/>
-      <w:lvlText w:val="%4."/>
-      <w:lvlJc w:val="left"/>
-      <w:pPr>
-        <w:ind w:left="2880" w:hanging="360"/>
-      </w:pPr>
-    </w:lvl>
-    <w:lvl w:ilvl="4">
-      <w:start w:val="1"/>
-      <w:numFmt w:val="decimal"/>
-      <w:lvlText w:val="%5."/>
-      <w:lvlJc w:val="left"/>
-      <w:pPr>
-        <w:ind w:left="3600" w:hanging="360"/>
-      </w:pPr>
-    </w:lvl>
-    <w:lvl w:ilvl="5">
-      <w:start w:val="1"/>
-      <w:numFmt w:val="decimal"/>
-      <w:lvlText w:val="%6."/>
-      <w:lvlJc w:val="left"/>
-      <w:pPr>
-        <w:ind w:left="4320" w:hanging="360"/>
-      </w:pPr>
-    </w:lvl>
-    <w:lvl w:ilvl="6">
-      <w:start w:val="1"/>
-      <w:numFmt w:val="decimal"/>
-      <w:lvlText w:val="%7."/>
-      <w:lvlJc w:val="left"/>
-      <w:pPr>
-        <w:ind w:left="5040" w:hanging="360"/>
-      </w:pPr>
-    </w:lvl>
-    <w:lvl w:ilvl="7">
-      <w:start w:val="1"/>
-      <w:numFmt w:val="decimal"/>
-      <w:lvlText w:val="%8."/>
-      <w:lvlJc w:val="left"/>
-      <w:pPr>
-        <w:ind w:left="5760" w:hanging="360"/>
-      </w:pPr>
-    </w:lvl>
-    <w:lvl w:ilvl="8">
-      <w:start w:val="1"/>
-      <w:numFmt w:val="decimal"/>
-      <w:lvlText w:val="%9."/>
-      <w:lvlJc w:val="left"/>
-      <w:pPr>
-        <w:ind w:left="6480" w:hanging="360"/>
-      </w:pPr>
-    </w:lvl>
-  </w:abstractNum>
   <w:num w:numId="1000">
     <w:abstractNumId w:val="990"/>
   </w:num>
   <w:num w:numId="1001">
+    <w:abstractNumId w:val="99411"/>
+    <w:lvlOverride w:ilvl="0">
+      <w:startOverride w:val="1"/>
+    </w:lvlOverride>
+    <w:lvlOverride w:ilvl="1">
+      <w:startOverride w:val="1"/>
+    </w:lvlOverride>
+    <w:lvlOverride w:ilvl="2">
+      <w:startOverride w:val="1"/>
+    </w:lvlOverride>
+    <w:lvlOverride w:ilvl="3">
+      <w:startOverride w:val="1"/>
+    </w:lvlOverride>
+    <w:lvlOverride w:ilvl="4">
+      <w:startOverride w:val="1"/>
+    </w:lvlOverride>
+    <w:lvlOverride w:ilvl="5">
+      <w:startOverride w:val="1"/>
+    </w:lvlOverride>
+    <w:lvlOverride w:ilvl="6">
+      <w:startOverride w:val="1"/>
+    </w:lvlOverride>
+    <w:lvlOverride w:ilvl="7">
+      <w:startOverride w:val="1"/>
+    </w:lvlOverride>
+    <w:lvlOverride w:ilvl="8">
+      <w:startOverride w:val="1"/>
+    </w:lvlOverride>
+  </w:num>
+  <w:num w:numId="1002">
     <w:abstractNumId w:val="991"/>
   </w:num>
-  <w:num w:numId="1002">
+  <w:num w:numId="1003">
     <w:abstractNumId w:val="99411"/>
     <w:lvlOverride w:ilvl="0">
       <w:startOverride w:val="1"/>

</xml_diff>